<commit_message>
feat: upgrade guides with First 5 Minutes + APA refs, fix harness tab switching
- User guides: added Your First 5 Minutes section, self-contained Eval GUI guide,
  version history tables, APA-formatted references, expanded proxy troubleshooting
- Guide builder: output path fixed to docs/, references updated to APA 7th edition
- Button smash harness: fixed 5 broken get_panels() calls, added --gui CLI option
- QA preflight checklist for cross-repo hardware verification

Co-Authored-By: Jeremy Randall <jeremy134@gmail.com>
</commit_message>
<xml_diff>
--- a/docs/EVAL_GUI_USER_GUIDE_V2.docx
+++ b/docs/EVAL_GUI_USER_GUIDE_V2.docx
@@ -47,7 +47,7 @@
           <w:color w:val="6B7280"/>
           <w:sz w:val="22"/>
         </w:rPr>
-        <w:t>Version 2026-04-15  |  Generated 2026-04-15 23:36</w:t>
+        <w:t>Version 2026-04-15  |  Generated 2026-04-16 01:13</w:t>
       </w:r>
     </w:p>
     <w:p>
@@ -121,7 +121,167 @@
         <w:pStyle w:val="Heading1"/>
       </w:pPr>
       <w:r>
-        <w:t>Quick Start</w:t>
+        <w:t>Document History</w:t>
+      </w:r>
+    </w:p>
+    <w:tbl>
+      <w:tblPr>
+        <w:tblStyle w:val="LightGrid-Accent1"/>
+        <w:tblW w:type="auto" w:w="0"/>
+        <w:tblLook w:firstColumn="1" w:firstRow="1" w:lastColumn="0" w:lastRow="0" w:noHBand="0" w:noVBand="1" w:val="04A0"/>
+      </w:tblPr>
+      <w:tblGrid>
+        <w:gridCol w:w="2160"/>
+        <w:gridCol w:w="2160"/>
+        <w:gridCol w:w="2160"/>
+        <w:gridCol w:w="2160"/>
+      </w:tblGrid>
+      <w:tr>
+        <w:tc>
+          <w:tcPr>
+            <w:tcW w:type="dxa" w:w="2160"/>
+          </w:tcPr>
+          <w:p>
+            <w:r/>
+            <w:r>
+              <w:rPr>
+                <w:b/>
+                <w:color w:val="003087"/>
+                <w:sz w:val="20"/>
+              </w:rPr>
+              <w:t>Rev</w:t>
+            </w:r>
+          </w:p>
+        </w:tc>
+        <w:tc>
+          <w:tcPr>
+            <w:tcW w:type="dxa" w:w="2160"/>
+          </w:tcPr>
+          <w:p>
+            <w:r/>
+            <w:r>
+              <w:rPr>
+                <w:b/>
+                <w:color w:val="003087"/>
+                <w:sz w:val="20"/>
+              </w:rPr>
+              <w:t>Date</w:t>
+            </w:r>
+          </w:p>
+        </w:tc>
+        <w:tc>
+          <w:tcPr>
+            <w:tcW w:type="dxa" w:w="2160"/>
+          </w:tcPr>
+          <w:p>
+            <w:r/>
+            <w:r>
+              <w:rPr>
+                <w:b/>
+                <w:color w:val="003087"/>
+                <w:sz w:val="20"/>
+              </w:rPr>
+              <w:t>Author</w:t>
+            </w:r>
+          </w:p>
+        </w:tc>
+        <w:tc>
+          <w:tcPr>
+            <w:tcW w:type="dxa" w:w="2160"/>
+          </w:tcPr>
+          <w:p>
+            <w:r/>
+            <w:r>
+              <w:rPr>
+                <w:b/>
+                <w:color w:val="003087"/>
+                <w:sz w:val="20"/>
+              </w:rPr>
+              <w:t>Description</w:t>
+            </w:r>
+          </w:p>
+        </w:tc>
+      </w:tr>
+      <w:tr>
+        <w:tc>
+          <w:tcPr>
+            <w:tcW w:type="dxa" w:w="2160"/>
+          </w:tcPr>
+          <w:p>
+            <w:r/>
+            <w:r>
+              <w:rPr>
+                <w:sz w:val="20"/>
+              </w:rPr>
+              <w:t>1.0</w:t>
+            </w:r>
+          </w:p>
+        </w:tc>
+        <w:tc>
+          <w:tcPr>
+            <w:tcW w:type="dxa" w:w="2160"/>
+          </w:tcPr>
+          <w:p>
+            <w:r/>
+            <w:r>
+              <w:rPr>
+                <w:sz w:val="20"/>
+              </w:rPr>
+              <w:t>2026-04-15</w:t>
+            </w:r>
+          </w:p>
+        </w:tc>
+        <w:tc>
+          <w:tcPr>
+            <w:tcW w:type="dxa" w:w="2160"/>
+          </w:tcPr>
+          <w:p>
+            <w:r/>
+            <w:r>
+              <w:rPr>
+                <w:sz w:val="20"/>
+              </w:rPr>
+              <w:t>J. Randall</w:t>
+            </w:r>
+          </w:p>
+        </w:tc>
+        <w:tc>
+          <w:tcPr>
+            <w:tcW w:type="dxa" w:w="2160"/>
+          </w:tcPr>
+          <w:p>
+            <w:r/>
+            <w:r>
+              <w:rPr>
+                <w:sz w:val="20"/>
+              </w:rPr>
+              <w:t>Initial release</w:t>
+            </w:r>
+          </w:p>
+        </w:tc>
+      </w:tr>
+    </w:tbl>
+    <w:p>
+      <w:r>
+        <w:br w:type="page"/>
+      </w:r>
+    </w:p>
+    <w:p>
+      <w:pPr>
+        <w:pStyle w:val="Heading1"/>
+      </w:pPr>
+      <w:r>
+        <w:t>Your First 5 Minutes</w:t>
+      </w:r>
+    </w:p>
+    <w:p>
+      <w:r>
+        <w:rPr>
+          <w:b w:val="0"/>
+          <w:i w:val="0"/>
+          <w:sz w:val="22"/>
+        </w:rPr>
+        <w:t>Get from launch to your first evaluation result in five steps.</w:t>
       </w:r>
     </w:p>
     <w:p>
@@ -130,9 +290,16 @@
       </w:pPr>
       <w:r>
         <w:rPr>
+          <w:b/>
           <w:sz w:val="22"/>
         </w:rPr>
-        <w:t>Windows 10/11, NVIDIA GPU, .venv installed</w:t>
+        <w:t xml:space="preserve">1. Launch:  </w:t>
+      </w:r>
+      <w:r>
+        <w:rPr>
+          <w:sz w:val="22"/>
+        </w:rPr>
+        <w:t>Double-click start_eval_gui.bat.</w:t>
       </w:r>
     </w:p>
     <w:p>
@@ -141,9 +308,16 @@
       </w:pPr>
       <w:r>
         <w:rPr>
+          <w:b/>
           <w:sz w:val="22"/>
         </w:rPr>
-        <w:t>Launch: start_eval_gui.bat</w:t>
+        <w:t xml:space="preserve">2. Open Launch tab:  </w:t>
+      </w:r>
+      <w:r>
+        <w:rPr>
+          <w:sz w:val="22"/>
+        </w:rPr>
+        <w:t>Click the Launch tab. Query pack and config are pre-filled.</w:t>
       </w:r>
     </w:p>
     <w:p>
@@ -152,9 +326,52 @@
       </w:pPr>
       <w:r>
         <w:rPr>
+          <w:b/>
           <w:sz w:val="22"/>
         </w:rPr>
-        <w:t>8 tabs: Overview, Launch, Aggregation, Count, RAGAS, Results, Compare, History</w:t>
+        <w:t xml:space="preserve">3. Set a limit:  </w:t>
+      </w:r>
+      <w:r>
+        <w:rPr>
+          <w:sz w:val="22"/>
+        </w:rPr>
+        <w:t>Set Limit to 5 (runs 5 queries instead of all 400).</w:t>
+      </w:r>
+    </w:p>
+    <w:p>
+      <w:pPr>
+        <w:pStyle w:val="ListBullet"/>
+      </w:pPr>
+      <w:r>
+        <w:rPr>
+          <w:b/>
+          <w:sz w:val="22"/>
+        </w:rPr>
+        <w:t xml:space="preserve">4. Run:  </w:t>
+      </w:r>
+      <w:r>
+        <w:rPr>
+          <w:sz w:val="22"/>
+        </w:rPr>
+        <w:t>Click Start. Watch live color-coded verdicts in the log.</w:t>
+      </w:r>
+    </w:p>
+    <w:p>
+      <w:pPr>
+        <w:pStyle w:val="ListBullet"/>
+      </w:pPr>
+      <w:r>
+        <w:rPr>
+          <w:b/>
+          <w:sz w:val="22"/>
+        </w:rPr>
+        <w:t xml:space="preserve">5. Review:  </w:t>
+      </w:r>
+      <w:r>
+        <w:rPr>
+          <w:sz w:val="22"/>
+        </w:rPr>
+        <w:t>Click the Results tab. Browse verdict, persona, and timing for each query.</w:t>
       </w:r>
     </w:p>
     <w:tbl>
@@ -190,7 +407,121 @@
               <w:rPr>
                 <w:sz w:val="20"/>
               </w:rPr>
-              <w:t>The Eval GUI is the operator's tool. The QA Workbench adds management-facing summary strips and regression. Both share the same core panels.</w:t>
+              <w:t>The Eval GUI is the operator's tool for hands-on evaluation. The QA Workbench adds management-facing summaries and regression testing.</w:t>
+            </w:r>
+          </w:p>
+        </w:tc>
+      </w:tr>
+    </w:tbl>
+    <w:p/>
+    <w:p>
+      <w:r>
+        <w:br w:type="page"/>
+      </w:r>
+    </w:p>
+    <w:p>
+      <w:pPr>
+        <w:pStyle w:val="Heading1"/>
+      </w:pPr>
+      <w:r>
+        <w:t>Installation and Prerequisites</w:t>
+      </w:r>
+    </w:p>
+    <w:p>
+      <w:pPr>
+        <w:pStyle w:val="ListBullet"/>
+      </w:pPr>
+      <w:r>
+        <w:rPr>
+          <w:sz w:val="22"/>
+        </w:rPr>
+        <w:t>Windows 10/11 with NVIDIA GPU (CUDA required)</w:t>
+      </w:r>
+    </w:p>
+    <w:p>
+      <w:pPr>
+        <w:pStyle w:val="ListBullet"/>
+      </w:pPr>
+      <w:r>
+        <w:rPr>
+          <w:sz w:val="22"/>
+        </w:rPr>
+        <w:t>HybridRAG V2 repo cloned with .venv installed (run INSTALL_EVAL_GUI.bat if needed)</w:t>
+      </w:r>
+    </w:p>
+    <w:p>
+      <w:pPr>
+        <w:pStyle w:val="ListBullet"/>
+      </w:pPr>
+      <w:r>
+        <w:rPr>
+          <w:sz w:val="22"/>
+        </w:rPr>
+        <w:t>LanceDB index built and populated (data/ directory)</w:t>
+      </w:r>
+    </w:p>
+    <w:p>
+      <w:pPr>
+        <w:pStyle w:val="Heading2"/>
+      </w:pPr>
+      <w:r>
+        <w:t>Launch</w:t>
+      </w:r>
+    </w:p>
+    <w:p>
+      <w:r>
+        <w:rPr>
+          <w:b w:val="0"/>
+          <w:i w:val="0"/>
+          <w:sz w:val="22"/>
+        </w:rPr>
+        <w:t>Double-click start_eval_gui.bat, or from a terminal:</w:t>
+      </w:r>
+    </w:p>
+    <w:p>
+      <w:r>
+        <w:rPr>
+          <w:b w:val="0"/>
+          <w:i/>
+          <w:sz w:val="22"/>
+        </w:rPr>
+        <w:t>cd /d C:\HybridRAG_V2 &amp;&amp; start_eval_gui.bat</w:t>
+      </w:r>
+    </w:p>
+    <w:tbl>
+      <w:tblPr>
+        <w:tblW w:type="auto" w:w="0"/>
+        <w:jc w:val="left"/>
+        <w:tblLook w:firstColumn="1" w:firstRow="1" w:lastColumn="0" w:lastRow="0" w:noHBand="0" w:noVBand="1" w:val="04A0"/>
+      </w:tblPr>
+      <w:tblGrid>
+        <w:gridCol w:w="8640"/>
+      </w:tblGrid>
+      <w:tr>
+        <w:tc>
+          <w:tcPr>
+            <w:tcW w:type="dxa" w:w="8640"/>
+            <w:shd w:fill="EFF6FF" w:val="clear"/>
+            <w:tcBorders>
+              <w:left w:val="single" w:sz="24" w:space="0" w:color="0078D4"/>
+              <w:top w:val="single" w:sz="4" w:space="0" w:color="EFF6FF"/>
+              <w:bottom w:val="single" w:sz="4" w:space="0" w:color="EFF6FF"/>
+              <w:right w:val="single" w:sz="4" w:space="0" w:color="EFF6FF"/>
+            </w:tcBorders>
+          </w:tcPr>
+          <w:p>
+            <w:r>
+              <w:rPr>
+                <w:b/>
+                <w:sz w:val="20"/>
+              </w:rPr>
+              <w:t xml:space="preserve">TIP:  </w:t>
+            </w:r>
+            <w:r>
+              <w:rPr>
+                <w:sz w:val="20"/>
+              </w:rPr>
+              <w:t>Behind a corporate proxy? Set HTTPS_PROXY in your shell before launching. The installer auto-exports your Windows CA certificates for SSL-intercepting proxies.</w:t>
             </w:r>
           </w:p>
         </w:tc>
@@ -202,7 +533,7 @@
         <w:pStyle w:val="Heading1"/>
       </w:pPr>
       <w:r>
-        <w:t>Tab: Launch</w:t>
+        <w:t>Tab 1: Overview</w:t>
       </w:r>
     </w:p>
     <w:p>
@@ -212,7 +543,7 @@
           <w:i w:val="0"/>
           <w:sz w:val="22"/>
         </w:rPr>
-        <w:t>Run the 400-query production evaluation. Same functionality as QA Workbench Baseline tab.</w:t>
+        <w:t>Read-only dashboard showing the current state of all evaluation lanes at a glance.</w:t>
       </w:r>
     </w:p>
     <w:p>
@@ -223,7 +554,7 @@
         <w:rPr>
           <w:sz w:val="22"/>
         </w:rPr>
-        <w:t>Select query pack, config, GPU index, optional limit</w:t>
+        <w:t>Baseline status and pass rate</w:t>
       </w:r>
     </w:p>
     <w:p>
@@ -234,7 +565,7 @@
         <w:rPr>
           <w:sz w:val="22"/>
         </w:rPr>
-        <w:t>Start/Stop with live progress and color-coded verdicts</w:t>
+        <w:t>Aggregation and count benchmark results</w:t>
       </w:r>
     </w:p>
     <w:p>
@@ -245,7 +576,440 @@
         <w:rPr>
           <w:sz w:val="22"/>
         </w:rPr>
-        <w:t>Save as Defaults persists your input paths</w:t>
+        <w:t>Strongest/weakest persona and query type breakdown</w:t>
+      </w:r>
+    </w:p>
+    <w:tbl>
+      <w:tblPr>
+        <w:tblW w:type="auto" w:w="0"/>
+        <w:jc w:val="left"/>
+        <w:tblLook w:firstColumn="1" w:firstRow="1" w:lastColumn="0" w:lastRow="0" w:noHBand="0" w:noVBand="1" w:val="04A0"/>
+      </w:tblPr>
+      <w:tblGrid>
+        <w:gridCol w:w="8640"/>
+      </w:tblGrid>
+      <w:tr>
+        <w:tc>
+          <w:tcPr>
+            <w:tcW w:type="dxa" w:w="8640"/>
+            <w:shd w:fill="F3F4F6" w:val="clear"/>
+            <w:tcBorders>
+              <w:left w:val="single" w:sz="24" w:space="0" w:color="6B7280"/>
+              <w:top w:val="single" w:sz="4" w:space="0" w:color="F3F4F6"/>
+              <w:bottom w:val="single" w:sz="4" w:space="0" w:color="F3F4F6"/>
+              <w:right w:val="single" w:sz="4" w:space="0" w:color="F3F4F6"/>
+            </w:tcBorders>
+          </w:tcPr>
+          <w:p>
+            <w:r>
+              <w:rPr>
+                <w:b/>
+                <w:sz w:val="20"/>
+              </w:rPr>
+              <w:t xml:space="preserve">NOTE:  </w:t>
+            </w:r>
+            <w:r>
+              <w:rPr>
+                <w:sz w:val="20"/>
+              </w:rPr>
+              <w:t>No setup needed. This tab reads existing result files. Missing data shows '(not yet available)' gracefully.</w:t>
+            </w:r>
+          </w:p>
+        </w:tc>
+      </w:tr>
+    </w:tbl>
+    <w:p/>
+    <w:p>
+      <w:pPr>
+        <w:pStyle w:val="Heading1"/>
+      </w:pPr>
+      <w:r>
+        <w:t>Tab 2: Launch (Production Eval)</w:t>
+      </w:r>
+    </w:p>
+    <w:p>
+      <w:r>
+        <w:rPr>
+          <w:b w:val="0"/>
+          <w:i w:val="0"/>
+          <w:sz w:val="22"/>
+        </w:rPr>
+        <w:t>Run the full 400-query production evaluation against the live index. This is the primary quality measurement tool.</w:t>
+      </w:r>
+    </w:p>
+    <w:p>
+      <w:pPr>
+        <w:pStyle w:val="Heading2"/>
+      </w:pPr>
+      <w:r>
+        <w:t>Setup</w:t>
+      </w:r>
+    </w:p>
+    <w:p>
+      <w:pPr>
+        <w:pStyle w:val="ListBullet"/>
+      </w:pPr>
+      <w:r>
+        <w:rPr>
+          <w:sz w:val="22"/>
+        </w:rPr>
+        <w:t>Query pack defaults to the 400-query production pack (3 personas, 4 query types)</w:t>
+      </w:r>
+    </w:p>
+    <w:p>
+      <w:pPr>
+        <w:pStyle w:val="ListBullet"/>
+      </w:pPr>
+      <w:r>
+        <w:rPr>
+          <w:sz w:val="22"/>
+        </w:rPr>
+        <w:t>Config defaults to config.yaml</w:t>
+      </w:r>
+    </w:p>
+    <w:p>
+      <w:pPr>
+        <w:pStyle w:val="ListBullet"/>
+      </w:pPr>
+      <w:r>
+        <w:rPr>
+          <w:sz w:val="22"/>
+        </w:rPr>
+        <w:t>GPU index: check nvidia-smi to see which GPU is available</w:t>
+      </w:r>
+    </w:p>
+    <w:p>
+      <w:pPr>
+        <w:pStyle w:val="ListBullet"/>
+      </w:pPr>
+      <w:r>
+        <w:rPr>
+          <w:sz w:val="22"/>
+        </w:rPr>
+        <w:t>Max Queries: blank for full 400, or 5-10 for a smoke test</w:t>
+      </w:r>
+    </w:p>
+    <w:p>
+      <w:pPr>
+        <w:pStyle w:val="Heading2"/>
+      </w:pPr>
+      <w:r>
+        <w:t>Running</w:t>
+      </w:r>
+    </w:p>
+    <w:p>
+      <w:r>
+        <w:rPr>
+          <w:b w:val="0"/>
+          <w:i w:val="0"/>
+          <w:sz w:val="22"/>
+        </w:rPr>
+        <w:t>Click Start. Progress bar advances per query. Live log shows color-coded verdicts:</w:t>
+      </w:r>
+    </w:p>
+    <w:p>
+      <w:pPr>
+        <w:pStyle w:val="ListBullet"/>
+      </w:pPr>
+      <w:r>
+        <w:rPr>
+          <w:sz w:val="22"/>
+        </w:rPr>
+        <w:t>Green = PASS (expected answer found in retrieved context)</w:t>
+      </w:r>
+    </w:p>
+    <w:p>
+      <w:pPr>
+        <w:pStyle w:val="ListBullet"/>
+      </w:pPr>
+      <w:r>
+        <w:rPr>
+          <w:sz w:val="22"/>
+        </w:rPr>
+        <w:t>Orange = PARTIAL (some relevant content, incomplete)</w:t>
+      </w:r>
+    </w:p>
+    <w:p>
+      <w:pPr>
+        <w:pStyle w:val="ListBullet"/>
+      </w:pPr>
+      <w:r>
+        <w:rPr>
+          <w:sz w:val="22"/>
+        </w:rPr>
+        <w:t>Red = MISS (expected content not retrieved)</w:t>
+      </w:r>
+    </w:p>
+    <w:p>
+      <w:r>
+        <w:rPr>
+          <w:b w:val="0"/>
+          <w:i w:val="0"/>
+          <w:sz w:val="22"/>
+        </w:rPr>
+        <w:t>Click Stop at any time to safely halt after the current query.</w:t>
+      </w:r>
+    </w:p>
+    <w:tbl>
+      <w:tblPr>
+        <w:tblW w:type="auto" w:w="0"/>
+        <w:jc w:val="left"/>
+        <w:tblLook w:firstColumn="1" w:firstRow="1" w:lastColumn="0" w:lastRow="0" w:noHBand="0" w:noVBand="1" w:val="04A0"/>
+      </w:tblPr>
+      <w:tblGrid>
+        <w:gridCol w:w="8640"/>
+      </w:tblGrid>
+      <w:tr>
+        <w:tc>
+          <w:tcPr>
+            <w:tcW w:type="dxa" w:w="8640"/>
+            <w:shd w:fill="FFFBEB" w:val="clear"/>
+            <w:tcBorders>
+              <w:left w:val="single" w:sz="24" w:space="0" w:color="D97706"/>
+              <w:top w:val="single" w:sz="4" w:space="0" w:color="FFFBEB"/>
+              <w:bottom w:val="single" w:sz="4" w:space="0" w:color="FFFBEB"/>
+              <w:right w:val="single" w:sz="4" w:space="0" w:color="FFFBEB"/>
+            </w:tcBorders>
+          </w:tcPr>
+          <w:p>
+            <w:r>
+              <w:rPr>
+                <w:b/>
+                <w:sz w:val="20"/>
+              </w:rPr>
+              <w:t xml:space="preserve">WARNING:  </w:t>
+            </w:r>
+            <w:r>
+              <w:rPr>
+                <w:sz w:val="20"/>
+              </w:rPr>
+              <w:t>PASS rate below 60% indicates a significant retrieval problem. Investigate corpus coverage and embedding quality before proceeding.</w:t>
+            </w:r>
+          </w:p>
+        </w:tc>
+      </w:tr>
+    </w:tbl>
+    <w:p/>
+    <w:p>
+      <w:pPr>
+        <w:pStyle w:val="Heading1"/>
+      </w:pPr>
+      <w:r>
+        <w:t>Tab 3: Aggregation</w:t>
+      </w:r>
+    </w:p>
+    <w:p>
+      <w:r>
+        <w:rPr>
+          <w:b w:val="0"/>
+          <w:i w:val="0"/>
+          <w:sz w:val="22"/>
+        </w:rPr>
+        <w:t>Tests cross-document aggregation accuracy. Can the system combine information from multiple sources correctly?</w:t>
+      </w:r>
+    </w:p>
+    <w:p>
+      <w:pPr>
+        <w:pStyle w:val="ListBullet"/>
+      </w:pPr>
+      <w:r>
+        <w:rPr>
+          <w:sz w:val="22"/>
+        </w:rPr>
+        <w:t>Manifest: 12-item aggregation seed (default)</w:t>
+      </w:r>
+    </w:p>
+    <w:p>
+      <w:pPr>
+        <w:pStyle w:val="ListBullet"/>
+      </w:pPr>
+      <w:r>
+        <w:rPr>
+          <w:sz w:val="22"/>
+        </w:rPr>
+        <w:t>Self-check mode (blank answers) tests against certified baseline</w:t>
+      </w:r>
+    </w:p>
+    <w:p>
+      <w:pPr>
+        <w:pStyle w:val="ListBullet"/>
+      </w:pPr>
+      <w:r>
+        <w:rPr>
+          <w:sz w:val="22"/>
+        </w:rPr>
+        <w:t>12/12 pass = baseline intact. Any failure = regression.</w:t>
+      </w:r>
+    </w:p>
+    <w:tbl>
+      <w:tblPr>
+        <w:tblW w:type="auto" w:w="0"/>
+        <w:jc w:val="left"/>
+        <w:tblLook w:firstColumn="1" w:firstRow="1" w:lastColumn="0" w:lastRow="0" w:noHBand="0" w:noVBand="1" w:val="04A0"/>
+      </w:tblPr>
+      <w:tblGrid>
+        <w:gridCol w:w="8640"/>
+      </w:tblGrid>
+      <w:tr>
+        <w:tc>
+          <w:tcPr>
+            <w:tcW w:type="dxa" w:w="8640"/>
+            <w:shd w:fill="EFF6FF" w:val="clear"/>
+            <w:tcBorders>
+              <w:left w:val="single" w:sz="24" w:space="0" w:color="0078D4"/>
+              <w:top w:val="single" w:sz="4" w:space="0" w:color="EFF6FF"/>
+              <w:bottom w:val="single" w:sz="4" w:space="0" w:color="EFF6FF"/>
+              <w:right w:val="single" w:sz="4" w:space="0" w:color="EFF6FF"/>
+            </w:tcBorders>
+          </w:tcPr>
+          <w:p>
+            <w:r>
+              <w:rPr>
+                <w:b/>
+                <w:sz w:val="20"/>
+              </w:rPr>
+              <w:t xml:space="preserve">TIP:  </w:t>
+            </w:r>
+            <w:r>
+              <w:rPr>
+                <w:sz w:val="20"/>
+              </w:rPr>
+              <w:t>Run Aggregation after any retrieval change. It catches cross-document combination errors that single-query tests miss.</w:t>
+            </w:r>
+          </w:p>
+        </w:tc>
+      </w:tr>
+    </w:tbl>
+    <w:p/>
+    <w:p>
+      <w:pPr>
+        <w:pStyle w:val="Heading1"/>
+      </w:pPr>
+      <w:r>
+        <w:t>Tab 4: Count</w:t>
+      </w:r>
+    </w:p>
+    <w:p>
+      <w:r>
+        <w:rPr>
+          <w:b w:val="0"/>
+          <w:i w:val="0"/>
+          <w:sz w:val="22"/>
+        </w:rPr>
+        <w:t>Verifies corpus coverage by counting entity mentions, documents, chunks, and rows.</w:t>
+      </w:r>
+    </w:p>
+    <w:p>
+      <w:pPr>
+        <w:pStyle w:val="ListBullet"/>
+      </w:pPr>
+      <w:r>
+        <w:rPr>
+          <w:sz w:val="22"/>
+        </w:rPr>
+        <w:t>7/7 frozen-expectation match = corpus complete, dedup stable</w:t>
+      </w:r>
+    </w:p>
+    <w:p>
+      <w:pPr>
+        <w:pStyle w:val="ListBullet"/>
+      </w:pPr>
+      <w:r>
+        <w:rPr>
+          <w:sz w:val="22"/>
+        </w:rPr>
+        <w:t>Count mismatch = new data ingested (expected) or dedup changed (investigate)</w:t>
+      </w:r>
+    </w:p>
+    <w:tbl>
+      <w:tblPr>
+        <w:tblW w:type="auto" w:w="0"/>
+        <w:jc w:val="left"/>
+        <w:tblLook w:firstColumn="1" w:firstRow="1" w:lastColumn="0" w:lastRow="0" w:noHBand="0" w:noVBand="1" w:val="04A0"/>
+      </w:tblPr>
+      <w:tblGrid>
+        <w:gridCol w:w="8640"/>
+      </w:tblGrid>
+      <w:tr>
+        <w:tc>
+          <w:tcPr>
+            <w:tcW w:type="dxa" w:w="8640"/>
+            <w:shd w:fill="F3F4F6" w:val="clear"/>
+            <w:tcBorders>
+              <w:left w:val="single" w:sz="24" w:space="0" w:color="6B7280"/>
+              <w:top w:val="single" w:sz="4" w:space="0" w:color="F3F4F6"/>
+              <w:bottom w:val="single" w:sz="4" w:space="0" w:color="F3F4F6"/>
+              <w:right w:val="single" w:sz="4" w:space="0" w:color="F3F4F6"/>
+            </w:tcBorders>
+          </w:tcPr>
+          <w:p>
+            <w:r>
+              <w:rPr>
+                <w:b/>
+                <w:sz w:val="20"/>
+              </w:rPr>
+              <w:t xml:space="preserve">NOTE:  </w:t>
+            </w:r>
+            <w:r>
+              <w:rPr>
+                <w:sz w:val="20"/>
+              </w:rPr>
+              <w:t>Count benchmark requires LanceDB and Entity DB paths. The defaults point to the standard install locations.</w:t>
+            </w:r>
+          </w:p>
+        </w:tc>
+      </w:tr>
+    </w:tbl>
+    <w:p/>
+    <w:p>
+      <w:pPr>
+        <w:pStyle w:val="Heading1"/>
+      </w:pPr>
+      <w:r>
+        <w:t>Tab 5: RAGAS</w:t>
+      </w:r>
+    </w:p>
+    <w:p>
+      <w:r>
+        <w:rPr>
+          <w:b w:val="0"/>
+          <w:i w:val="0"/>
+          <w:sz w:val="22"/>
+        </w:rPr>
+        <w:t>Industry-standard retrieval quality measurement. See the RAGAS Reference section later in this guide for full details on metrics and interpretation.</w:t>
+      </w:r>
+    </w:p>
+    <w:p>
+      <w:pPr>
+        <w:pStyle w:val="ListBullet"/>
+      </w:pPr>
+      <w:r>
+        <w:rPr>
+          <w:sz w:val="22"/>
+        </w:rPr>
+        <w:t>Analysis Only: fast readiness check, no GPU needed</w:t>
+      </w:r>
+    </w:p>
+    <w:p>
+      <w:pPr>
+        <w:pStyle w:val="ListBullet"/>
+      </w:pPr>
+      <w:r>
+        <w:rPr>
+          <w:sz w:val="22"/>
+        </w:rPr>
+        <w:t>Full Execution: measures context precision and context recall per query</w:t>
+      </w:r>
+    </w:p>
+    <w:p>
+      <w:pPr>
+        <w:pStyle w:val="ListBullet"/>
+      </w:pPr>
+      <w:r>
+        <w:rPr>
+          <w:sz w:val="22"/>
+        </w:rPr>
+        <w:t>Set Limit to 3-10 for quick tests</w:t>
       </w:r>
     </w:p>
     <w:p>
@@ -253,7 +1017,7 @@
         <w:pStyle w:val="Heading1"/>
       </w:pPr>
       <w:r>
-        <w:t>Tab: Results</w:t>
+        <w:t>Tab 6: Results</w:t>
       </w:r>
     </w:p>
     <w:p>
@@ -286,6 +1050,17 @@
           <w:sz w:val="22"/>
         </w:rPr>
         <w:t>Click a row for full details: routing, top chunks, per-stage timing</w:t>
+      </w:r>
+    </w:p>
+    <w:p>
+      <w:pPr>
+        <w:pStyle w:val="ListBullet"/>
+      </w:pPr>
+      <w:r>
+        <w:rPr>
+          <w:sz w:val="22"/>
+        </w:rPr>
+        <w:t>Use this tab to investigate specific MISS or PARTIAL verdicts</w:t>
       </w:r>
     </w:p>
     <w:tbl>
@@ -333,7 +1108,7 @@
         <w:pStyle w:val="Heading1"/>
       </w:pPr>
       <w:r>
-        <w:t>Tab: Compare</w:t>
+        <w:t>Tab 7: Compare</w:t>
       </w:r>
     </w:p>
     <w:p>
@@ -343,7 +1118,7 @@
           <w:i w:val="0"/>
           <w:sz w:val="22"/>
         </w:rPr>
-        <w:t>Diff two evaluation runs side-by-side.</w:t>
+        <w:t>Diff two evaluation runs side-by-side to see what changed.</w:t>
       </w:r>
     </w:p>
     <w:p>
@@ -424,7 +1199,7 @@
         <w:pStyle w:val="Heading1"/>
       </w:pPr>
       <w:r>
-        <w:t>Tabs: Aggregation, Count, RAGAS, History</w:t>
+        <w:t>Tab 8: History</w:t>
       </w:r>
     </w:p>
     <w:p>
@@ -434,9 +1209,49 @@
           <w:i w:val="0"/>
           <w:sz w:val="22"/>
         </w:rPr>
-        <w:t>Same panels as QA Workbench. See the QA Workbench User Guide for detailed instructions.</w:t>
+        <w:t>Browse all past evaluation runs in a sortable table. Track quality over time.</w:t>
       </w:r>
     </w:p>
+    <w:tbl>
+      <w:tblPr>
+        <w:tblW w:type="auto" w:w="0"/>
+        <w:jc w:val="left"/>
+        <w:tblLook w:firstColumn="1" w:firstRow="1" w:lastColumn="0" w:lastRow="0" w:noHBand="0" w:noVBand="1" w:val="04A0"/>
+      </w:tblPr>
+      <w:tblGrid>
+        <w:gridCol w:w="8640"/>
+      </w:tblGrid>
+      <w:tr>
+        <w:tc>
+          <w:tcPr>
+            <w:tcW w:type="dxa" w:w="8640"/>
+            <w:shd w:fill="EFF6FF" w:val="clear"/>
+            <w:tcBorders>
+              <w:left w:val="single" w:sz="24" w:space="0" w:color="0078D4"/>
+              <w:top w:val="single" w:sz="4" w:space="0" w:color="EFF6FF"/>
+              <w:bottom w:val="single" w:sz="4" w:space="0" w:color="EFF6FF"/>
+              <w:right w:val="single" w:sz="4" w:space="0" w:color="EFF6FF"/>
+            </w:tcBorders>
+          </w:tcPr>
+          <w:p>
+            <w:r>
+              <w:rPr>
+                <w:b/>
+                <w:sz w:val="20"/>
+              </w:rPr>
+              <w:t xml:space="preserve">TIP:  </w:t>
+            </w:r>
+            <w:r>
+              <w:rPr>
+                <w:sz w:val="20"/>
+              </w:rPr>
+              <w:t>After any retrieval-side code change, the recommended benchmark order is: Count &gt; Aggregation &gt; full Baseline &gt; append ledger row.</w:t>
+            </w:r>
+          </w:p>
+        </w:tc>
+      </w:tr>
+    </w:tbl>
+    <w:p/>
     <w:p>
       <w:r>
         <w:br w:type="page"/>
@@ -1266,7 +2081,7 @@
               <w:rPr>
                 <w:sz w:val="20"/>
               </w:rPr>
-              <w:t>In medical, legal, or defense contexts, even a 5% hallucination rate is dangerous. This metric tracks the proportion of responses containing claims not backed by any retrieved evidence. Target: below 2% for regulated industries.</w:t>
+              <w:t>In medical, legal, or enterprise contexts, even a 5% hallucination rate is dangerous. This metric tracks the proportion of responses containing claims not backed by any retrieved evidence. Target: below 2% for regulated industries.</w:t>
             </w:r>
           </w:p>
         </w:tc>
@@ -1814,7 +2629,7 @@
               <w:rPr>
                 <w:sz w:val="20"/>
               </w:rPr>
-              <w:t>LLM vs Non-LLM metrics: Our current metrics use algorithmic fuzzy matching (no external API needed). LLM-based metrics use a judge model for deeper semantic evaluation but require API access and cost. The Non-LLM variants are the correct choice for offline, air-gapped, and cost-controlled environments.</w:t>
+              <w:t>LLM vs Non-LLM metrics: Our current metrics use algorithmic fuzzy matching (no external API needed). LLM-based metrics use a judge model for deeper semantic evaluation but require API access and cost. The Non-LLM variants are the correct choice for offline, offline, and cost-controlled environments.</w:t>
             </w:r>
           </w:p>
         </w:tc>
@@ -3811,6 +4626,46 @@
         <w:t>Troubleshooting</w:t>
       </w:r>
     </w:p>
+    <w:tbl>
+      <w:tblPr>
+        <w:tblW w:type="auto" w:w="0"/>
+        <w:jc w:val="left"/>
+        <w:tblLook w:firstColumn="1" w:firstRow="1" w:lastColumn="0" w:lastRow="0" w:noHBand="0" w:noVBand="1" w:val="04A0"/>
+      </w:tblPr>
+      <w:tblGrid>
+        <w:gridCol w:w="8640"/>
+      </w:tblGrid>
+      <w:tr>
+        <w:tc>
+          <w:tcPr>
+            <w:tcW w:type="dxa" w:w="8640"/>
+            <w:shd w:fill="FEF2F2" w:val="clear"/>
+            <w:tcBorders>
+              <w:left w:val="single" w:sz="24" w:space="0" w:color="DC2626"/>
+              <w:top w:val="single" w:sz="4" w:space="0" w:color="FEF2F2"/>
+              <w:bottom w:val="single" w:sz="4" w:space="0" w:color="FEF2F2"/>
+              <w:right w:val="single" w:sz="4" w:space="0" w:color="FEF2F2"/>
+            </w:tcBorders>
+          </w:tcPr>
+          <w:p>
+            <w:r>
+              <w:rPr>
+                <w:b/>
+                <w:sz w:val="20"/>
+              </w:rPr>
+              <w:t xml:space="preserve">CAUTION:  </w:t>
+            </w:r>
+            <w:r>
+              <w:rPr>
+                <w:sz w:val="20"/>
+              </w:rPr>
+              <w:t>Window opens and closes immediately? Run from terminal to see the error. Most common: missing .venv or broken Python. Run INSTALL_EVAL_GUI.bat.</w:t>
+            </w:r>
+          </w:p>
+        </w:tc>
+      </w:tr>
+    </w:tbl>
+    <w:p/>
     <w:p>
       <w:pPr>
         <w:pStyle w:val="ListBullet"/>
@@ -3819,7 +4674,51 @@
         <w:rPr>
           <w:sz w:val="22"/>
         </w:rPr>
-        <w:t>Same troubleshooting steps as QA Workbench. See QA Workbench User Guide.</w:t>
+        <w:t>CUDA not available: Check nvidia-smi. Set CUDA_VISIBLE_DEVICES=0 before launching.</w:t>
+      </w:r>
+    </w:p>
+    <w:p>
+      <w:pPr>
+        <w:pStyle w:val="ListBullet"/>
+      </w:pPr>
+      <w:r>
+        <w:rPr>
+          <w:sz w:val="22"/>
+        </w:rPr>
+        <w:t>Proxy errors: Set HTTPS_PROXY and HTTP_PROXY in your shell before launch.</w:t>
+      </w:r>
+    </w:p>
+    <w:p>
+      <w:pPr>
+        <w:pStyle w:val="ListBullet"/>
+      </w:pPr>
+      <w:r>
+        <w:rPr>
+          <w:sz w:val="22"/>
+        </w:rPr>
+        <w:t>SSL certificate errors: Check .venv/ca-bundle.pem exists and .venv/pip.ini has cert = line.</w:t>
+      </w:r>
+    </w:p>
+    <w:p>
+      <w:pPr>
+        <w:pStyle w:val="ListBullet"/>
+      </w:pPr>
+      <w:r>
+        <w:rPr>
+          <w:sz w:val="22"/>
+        </w:rPr>
+        <w:t>RAGAS blocked: Run tools/install_ragas_proxy_ready_2026-04-15.ps1</w:t>
+      </w:r>
+    </w:p>
+    <w:p>
+      <w:pPr>
+        <w:pStyle w:val="ListBullet"/>
+      </w:pPr>
+      <w:r>
+        <w:rPr>
+          <w:sz w:val="22"/>
+        </w:rPr>
+        <w:t>Results not in History: Results must be saved as production_eval_results*.json in docs/</w:t>
       </w:r>
     </w:p>
     <w:p>
@@ -3848,7 +4747,7 @@
           <w:color w:val="6B7280"/>
           <w:sz w:val="20"/>
         </w:rPr>
-        <w:t>Es, S., James, J., Espinosa-Anke, L., &amp; Schockaert, S. (2023). "RAGAS: Automated Evaluation of Retrieval Augmented Generation." arXiv:2309.15217. https://arxiv.org/abs/2309.15217</w:t>
+        <w:t>Es, S., James, J., Espinosa-Anke, L., &amp; Schockaert, S. (2023). RAGAS: Automated evaluation of retrieval augmented generation [Preprint]. arXiv. https://doi.org/10.48550/arXiv.2309.15217</w:t>
       </w:r>
     </w:p>
     <w:p>
@@ -3864,7 +4763,7 @@
           <w:color w:val="6B7280"/>
           <w:sz w:val="20"/>
         </w:rPr>
-        <w:t>Explodinggradients. RAGAS — Retrieval Augmented Generation Assessment. https://docs.ragas.io</w:t>
+        <w:t>Explodinggradients. (2024). RAGAS: Retrieval augmented generation assessment (Version 0.4) [Software documentation]. https://docs.ragas.io</w:t>
       </w:r>
     </w:p>
     <w:p>
@@ -3880,7 +4779,7 @@
           <w:color w:val="6B7280"/>
           <w:sz w:val="20"/>
         </w:rPr>
-        <w:t>Industry benchmark thresholds adapted from Qdrant RAG Evaluation Guide (qdrant.tech/blog/rag-evaluation-guide) and PremAI RAG Evaluation Metrics &amp; Testing 2026 (blog.premai.io).</w:t>
+        <w:t>Qdrant. (2025). RAG evaluation guide: Metrics, benchmarks, and best practices. https://qdrant.tech/blog/rag-evaluation-guide/   |   PremAI. (2026). RAG evaluation metrics and testing. https://blog.premai.io/rag-evaluation-metrics/</w:t>
       </w:r>
     </w:p>
     <w:p>
@@ -3889,14 +4788,14 @@
           <w:b/>
           <w:sz w:val="20"/>
         </w:rPr>
-        <w:t xml:space="preserve">Microsoft Writing Style Guide:  </w:t>
+        <w:t xml:space="preserve">Document Design:  </w:t>
       </w:r>
       <w:r>
         <w:rPr>
           <w:color w:val="6B7280"/>
           <w:sz w:val="20"/>
         </w:rPr>
-        <w:t>Microsoft Corporation. Microsoft Writing Style Guide. https://learn.microsoft.com/en-us/style-guide/welcome/</w:t>
+        <w:t>Microsoft Corporation. (2024). Microsoft writing style guide. https://learn.microsoft.com/en-us/style-guide/welcome/   |   Google. (2024). Google developer documentation style guide. https://developers.google.com/style</w:t>
       </w:r>
     </w:p>
     <w:p>
@@ -3905,14 +4804,14 @@
           <w:b/>
           <w:sz w:val="20"/>
         </w:rPr>
-        <w:t xml:space="preserve">Typography Standards:  </w:t>
+        <w:t xml:space="preserve">Technical Documentation:  </w:t>
       </w:r>
       <w:r>
         <w:rPr>
           <w:color w:val="6B7280"/>
           <w:sz w:val="20"/>
         </w:rPr>
-        <w:t>Document typography follows recommendations from the Google Developer Documentation Style Guide and ISO/IEC Directives Part 2 for structure and drafting of technical documents.</w:t>
+        <w:t>Write the Docs Community. (2025). Software documentation guide. https://www.writethedocs.org/guide/   |   TechLasi. (2026). Software documentation best practices: The complete guide. https://techlasi.com/savvy/software-documentation-best-practices/</w:t>
       </w:r>
     </w:p>
     <w:sectPr>
@@ -3938,7 +4837,7 @@
         <w:color w:val="6B7280"/>
         <w:sz w:val="16"/>
       </w:rPr>
-      <w:t>HybridRAG V2 — Eval GUI User Guide — 2026-04-15 — J. Randall</w:t>
+      <w:t>HybridRAG V2 — Eval GUI User Guide — 2026-04-16 — J. Randall</w:t>
     </w:r>
   </w:p>
 </w:ftr>

</xml_diff>